<commit_message>
Nop bai thuc hanh Lab 4
</commit_message>
<xml_diff>
--- a/LAB4/Lad4_11DH_TMDT_1150070033_PhamThiMinhPhi.docx
+++ b/LAB4/Lad4_11DH_TMDT_1150070033_PhamThiMinhPhi.docx
@@ -106,61 +106,35 @@
     </w:p>
     <w:p>
       <w:pPr>
-        <w:rPr>
-          <w:rFonts w:ascii="Times New Roman" w:hAnsi="Times New Roman" w:eastAsia="Times New Roman" w:cs="Times New Roman"/>
+        <w:bidi w:val="0"/>
+        <w:rPr>
+          <w:rFonts w:hint="default" w:ascii="Times New Roman" w:hAnsi="Times New Roman" w:cs="Times New Roman"/>
+          <w:b w:val="0"/>
+          <w:bCs w:val="0"/>
+          <w:sz w:val="32"/>
+          <w:szCs w:val="32"/>
+        </w:rPr>
+      </w:pPr>
+      <w:r>
+        <w:rPr>
+          <w:rFonts w:hint="default" w:ascii="Times New Roman" w:hAnsi="Times New Roman" w:cs="Times New Roman"/>
           <w:b/>
           <w:bCs/>
-          <w:i w:val="0"/>
-          <w:iCs w:val="0"/>
-          <w:smallCaps w:val="0"/>
-          <w:strike w:val="0"/>
-          <w:color w:val="auto"/>
           <w:sz w:val="32"/>
           <w:szCs w:val="32"/>
-          <w:u w:val="none"/>
-          <w:shd w:val="clear" w:fill="auto"/>
-          <w:vertAlign w:val="baseline"/>
-          <w:rtl w:val="0"/>
-        </w:rPr>
-      </w:pPr>
-      <w:r>
-        <w:rPr>
-          <w:rFonts w:hint="default" w:ascii="Times New Roman" w:hAnsi="Times New Roman" w:eastAsia="sans-serif" w:cs="Times New Roman"/>
-          <w:b/>
-          <w:bCs/>
-          <w:color w:val="auto"/>
+        </w:rPr>
+        <w:t xml:space="preserve">Bài thực hành: </w:t>
+      </w:r>
+      <w:r>
+        <w:rPr>
+          <w:rFonts w:hint="default" w:ascii="Times New Roman" w:hAnsi="Times New Roman" w:cs="Times New Roman"/>
+          <w:b w:val="0"/>
+          <w:bCs w:val="0"/>
           <w:sz w:val="32"/>
           <w:szCs w:val="32"/>
-        </w:rPr>
-        <w:t>Bài thực hành:</w:t>
-      </w:r>
-      <w:r>
-        <w:rPr>
-          <w:rFonts w:hint="default" w:ascii="Times New Roman" w:hAnsi="Times New Roman" w:eastAsia="sans-serif" w:cs="Times New Roman"/>
-          <w:color w:val="auto"/>
-          <w:sz w:val="32"/>
-          <w:szCs w:val="32"/>
-        </w:rPr>
-        <w:t xml:space="preserve"> </w:t>
-      </w:r>
-      <w:r>
-        <w:rPr>
-          <w:rFonts w:ascii="Times New Roman" w:hAnsi="Times New Roman" w:eastAsia="Times New Roman" w:cs="Times New Roman"/>
-          <w:b/>
-          <w:bCs/>
-          <w:i w:val="0"/>
-          <w:iCs w:val="0"/>
-          <w:smallCaps w:val="0"/>
-          <w:strike w:val="0"/>
-          <w:color w:val="auto"/>
-          <w:sz w:val="32"/>
-          <w:szCs w:val="32"/>
-          <w:u w:val="none"/>
-          <w:shd w:val="clear" w:fill="auto"/>
-          <w:vertAlign w:val="baseline"/>
           <w:rtl w:val="0"/>
         </w:rPr>
-        <w:t>Dựng môi trường máy ảo an toàn trên máy cá nhân</w:t>
+        <w:t>KHẢO SÁT VÀ ĐÁNH GIÁ BỀ MẶT MẠNG BẰNG NMAP</w:t>
       </w:r>
     </w:p>
     <w:p>
@@ -259,6 +233,21 @@
     </w:p>
     <w:p>
       <w:pPr>
+        <w:keepNext w:val="0"/>
+        <w:keepLines w:val="0"/>
+        <w:pageBreakBefore w:val="0"/>
+        <w:widowControl w:val="0"/>
+        <w:pBdr>
+          <w:top w:val="none" w:color="auto" w:sz="0" w:space="0"/>
+          <w:left w:val="none" w:color="auto" w:sz="0" w:space="0"/>
+          <w:bottom w:val="none" w:color="auto" w:sz="0" w:space="0"/>
+          <w:right w:val="none" w:color="auto" w:sz="0" w:space="0"/>
+          <w:between w:val="none" w:color="auto" w:sz="0" w:space="0"/>
+        </w:pBdr>
+        <w:shd w:val="clear" w:fill="auto"/>
+        <w:spacing w:before="8" w:after="0" w:line="240" w:lineRule="auto"/>
+        <w:ind w:left="55" w:right="0" w:firstLine="0"/>
+        <w:jc w:val="left"/>
         <w:rPr>
           <w:rFonts w:ascii="Times New Roman" w:hAnsi="Times New Roman" w:eastAsia="Times New Roman" w:cs="Times New Roman"/>
           <w:b/>
@@ -276,6 +265,25 @@
           <w:rtl w:val="0"/>
         </w:rPr>
       </w:pPr>
+      <w:r>
+        <w:rPr>
+          <w:rFonts w:ascii="Times New Roman" w:hAnsi="Times New Roman" w:eastAsia="Times New Roman" w:cs="Times New Roman"/>
+          <w:b/>
+          <w:bCs/>
+          <w:i w:val="0"/>
+          <w:iCs w:val="0"/>
+          <w:smallCaps w:val="0"/>
+          <w:strike w:val="0"/>
+          <w:color w:val="auto"/>
+          <w:sz w:val="26"/>
+          <w:szCs w:val="26"/>
+          <w:u w:val="none"/>
+          <w:shd w:val="clear" w:fill="auto"/>
+          <w:vertAlign w:val="baseline"/>
+          <w:rtl w:val="0"/>
+        </w:rPr>
+        <w:t xml:space="preserve">Dựng môi trường máy ảo an toàn trên máy cá nhân </w:t>
+      </w:r>
     </w:p>
     <w:p>
       <w:pPr>
@@ -365,6 +373,8 @@
           <w:rtl w:val="0"/>
         </w:rPr>
       </w:pPr>
+      <w:bookmarkStart w:id="0" w:name="_GoBack"/>
+      <w:bookmarkEnd w:id="0"/>
     </w:p>
     <w:p>
       <w:pPr>
@@ -21994,6 +22004,7 @@
         <w:pageBreakBefore w:val="0"/>
         <w:widowControl w:val="0"/>
         <w:numPr>
+          <w:ilvl w:val="0"/>
           <w:numId w:val="0"/>
         </w:numPr>
         <w:pBdr>
@@ -22157,6 +22168,7 @@
         <w:pageBreakBefore w:val="0"/>
         <w:widowControl w:val="0"/>
         <w:numPr>
+          <w:ilvl w:val="0"/>
           <w:numId w:val="0"/>
         </w:numPr>
         <w:pBdr>
@@ -22302,6 +22314,7 @@
         <w:pageBreakBefore w:val="0"/>
         <w:widowControl w:val="0"/>
         <w:numPr>
+          <w:ilvl w:val="0"/>
           <w:numId w:val="0"/>
         </w:numPr>
         <w:pBdr>
@@ -22810,6 +22823,7 @@
         <w:pageBreakBefore w:val="0"/>
         <w:widowControl w:val="0"/>
         <w:numPr>
+          <w:ilvl w:val="0"/>
           <w:numId w:val="0"/>
         </w:numPr>
         <w:pBdr>
@@ -24715,6 +24729,7 @@
     <w:p>
       <w:pPr>
         <w:numPr>
+          <w:ilvl w:val="0"/>
           <w:numId w:val="0"/>
         </w:numPr>
         <w:bidi w:val="0"/>
@@ -24741,6 +24756,7 @@
     <w:p>
       <w:pPr>
         <w:numPr>
+          <w:ilvl w:val="0"/>
           <w:numId w:val="0"/>
         </w:numPr>
         <w:bidi w:val="0"/>
@@ -24806,6 +24822,7 @@
     <w:p>
       <w:pPr>
         <w:numPr>
+          <w:ilvl w:val="0"/>
           <w:numId w:val="0"/>
         </w:numPr>
         <w:bidi w:val="0"/>
@@ -24832,6 +24849,7 @@
     <w:p>
       <w:pPr>
         <w:numPr>
+          <w:ilvl w:val="0"/>
           <w:numId w:val="0"/>
         </w:numPr>
         <w:bidi w:val="0"/>
@@ -24897,6 +24915,7 @@
     <w:p>
       <w:pPr>
         <w:numPr>
+          <w:ilvl w:val="0"/>
           <w:numId w:val="0"/>
         </w:numPr>
         <w:bidi w:val="0"/>
@@ -24923,6 +24942,7 @@
     <w:p>
       <w:pPr>
         <w:numPr>
+          <w:ilvl w:val="0"/>
           <w:numId w:val="0"/>
         </w:numPr>
         <w:bidi w:val="0"/>
@@ -24988,6 +25008,7 @@
     <w:p>
       <w:pPr>
         <w:numPr>
+          <w:ilvl w:val="0"/>
           <w:numId w:val="0"/>
         </w:numPr>
         <w:bidi w:val="0"/>
@@ -25014,6 +25035,7 @@
     <w:p>
       <w:pPr>
         <w:numPr>
+          <w:ilvl w:val="0"/>
           <w:numId w:val="0"/>
         </w:numPr>
         <w:bidi w:val="0"/>
@@ -25079,6 +25101,7 @@
     <w:p>
       <w:pPr>
         <w:numPr>
+          <w:ilvl w:val="0"/>
           <w:numId w:val="0"/>
         </w:numPr>
         <w:bidi w:val="0"/>
@@ -25105,6 +25128,7 @@
     <w:p>
       <w:pPr>
         <w:numPr>
+          <w:ilvl w:val="0"/>
           <w:numId w:val="0"/>
         </w:numPr>
         <w:bidi w:val="0"/>
@@ -25170,6 +25194,7 @@
     <w:p>
       <w:pPr>
         <w:numPr>
+          <w:ilvl w:val="0"/>
           <w:numId w:val="0"/>
         </w:numPr>
         <w:bidi w:val="0"/>
@@ -25196,6 +25221,7 @@
     <w:p>
       <w:pPr>
         <w:numPr>
+          <w:ilvl w:val="0"/>
           <w:numId w:val="0"/>
         </w:numPr>
         <w:bidi w:val="0"/>
@@ -25261,6 +25287,7 @@
     <w:p>
       <w:pPr>
         <w:numPr>
+          <w:ilvl w:val="0"/>
           <w:numId w:val="0"/>
         </w:numPr>
         <w:bidi w:val="0"/>
@@ -25287,6 +25314,7 @@
     <w:p>
       <w:pPr>
         <w:numPr>
+          <w:ilvl w:val="0"/>
           <w:numId w:val="0"/>
         </w:numPr>
         <w:bidi w:val="0"/>
@@ -25352,6 +25380,7 @@
     <w:p>
       <w:pPr>
         <w:numPr>
+          <w:ilvl w:val="0"/>
           <w:numId w:val="0"/>
         </w:numPr>
         <w:bidi w:val="0"/>
@@ -26126,8 +26155,6 @@
         </w:rPr>
         <w:t>Ta đối chiếu với kết quả tìm được trên trên ta sẽ nhận thấy rằng là k</w:t>
       </w:r>
-      <w:bookmarkStart w:id="0" w:name="_GoBack"/>
-      <w:bookmarkEnd w:id="0"/>
       <w:r>
         <w:rPr>
           <w:rFonts w:hint="default" w:ascii="Times New Roman" w:hAnsi="Times New Roman" w:cs="Times New Roman"/>
@@ -26793,7 +26820,7 @@
     <w:lsdException w:unhideWhenUsed="0" w:uiPriority="0" w:semiHidden="0" w:name="HTML Acronym"/>
     <w:lsdException w:unhideWhenUsed="0" w:uiPriority="0" w:semiHidden="0" w:name="HTML Address"/>
     <w:lsdException w:unhideWhenUsed="0" w:uiPriority="0" w:semiHidden="0" w:name="HTML Cite"/>
-    <w:lsdException w:unhideWhenUsed="0" w:uiPriority="0" w:semiHidden="0" w:name="HTML Code"/>
+    <w:lsdException w:qFormat="1" w:unhideWhenUsed="0" w:uiPriority="0" w:semiHidden="0" w:name="HTML Code"/>
     <w:lsdException w:unhideWhenUsed="0" w:uiPriority="0" w:semiHidden="0" w:name="HTML Definition"/>
     <w:lsdException w:unhideWhenUsed="0" w:uiPriority="0" w:semiHidden="0" w:name="HTML Keyboard"/>
     <w:lsdException w:unhideWhenUsed="0" w:uiPriority="0" w:semiHidden="0" w:name="HTML Preformatted"/>
@@ -27018,6 +27045,7 @@
   <w:style w:type="character" w:styleId="6">
     <w:name w:val="HTML Code"/>
     <w:basedOn w:val="4"/>
+    <w:qFormat/>
     <w:uiPriority w:val="0"/>
     <w:rPr>
       <w:rFonts w:ascii="Courier New" w:hAnsi="Courier New" w:cs="Courier New"/>

</xml_diff>